<commit_message>
docs: clarify Dalgo and Creatnet responsibilities
</commit_message>
<xml_diff>
--- a/docs/Product_Intelligence_Discovery_Handoff_2026-09-29.docx
+++ b/docs/Product_Intelligence_Discovery_Handoff_2026-09-29.docx
@@ -31,21 +31,21 @@
     </w:p>
     <w:p>
       <w:r>
-        <w:t xml:space="preserve">Product Intelligence, also called PI or Steele Intel in earlier files, is Creatnet's effort to help the Steele business make better product, e-commerce, inventory, and marketing decisions from data that currently sits in separate systems. The original plan was to build a custom database, source connectors, dashboards, and later AI features. </w:t>
+        <w:t xml:space="preserve">Product Intelligence, also called PI or Steele Intel in earlier files, is Creatnet's effort to help the Steele business make better product, e-commerce, inventory, and marketing decisions from data that currently sits in separate systems. The June 2026 product brief remains the direction for the product </w:t>
       </w:r>
       <w:r>
         <w:rPr>
           <w:b/>
         </w:rPr>
-        <w:t>That build plan is no longer active.</w:t>
+        <w:t>except for its plan for Creatnet to design and run the aggregation database</w:t>
       </w:r>
       <w:r>
-        <w:t xml:space="preserve"> Creatnet has signed a deal with Project Tech4Dev to use its open-source platform, Dalgo. The deal and the switch to Dalgo are the only current implementation facts confirmed by the project owner for this handoff. The scope of the agreement, delivery plan, source connectors, workspace access, hosting, ownership, and timeline have not been supplied here.</w:t>
+        <w:t>. Creatnet has signed a deal with Project Tech4Dev to use its open-source platform, Dalgo, for data aggregation and the database. Creatnet remains responsible for custom source connectors if Dalgo lacks a needed integration, data analytics, dashboards and other product features, and later machine-learning (ML) pipelines. The exact contract, technical handoff, delivery sequence, hosting, and timeline are not recorded in this repository.</w:t>
       </w:r>
     </w:p>
     <w:p>
       <w:r>
-        <w:t>Product discovery continues. It means learning which decisions people need to make, what each data source can actually provide, how measures should be defined, where data disagrees, and whether Dalgo can support the agreed workflows. This work can now be done through stakeholder conversations, source-system reports, official documentation, Dalgo demonstrations, and small evidence checks. The Python scripts in this repository remain historical research tools; using them is optional.</w:t>
+        <w:t>Product discovery continues. It means learning which decisions people need to make, what each data source can actually provide, how measures should be defined, where data disagrees, and how Creatnet's work will use the data aggregated in Dalgo. This work can be done through stakeholder conversations, source-system reports, official documentation, Dalgo demonstrations, and small evidence checks. The Python scripts in this repository remain useful starting points when a connector or detailed source check is needed; new discovery research does not have to involve code.</w:t>
       </w:r>
     </w:p>
     <w:p>
@@ -56,7 +56,7 @@
         <w:rPr>
           <w:b/>
         </w:rPr>
-        <w:t>confirmed current direction</w:t>
+        <w:t>confirmed current responsibilities</w:t>
       </w:r>
       <w:r>
         <w:t xml:space="preserve">, </w:t>
@@ -74,7 +74,7 @@
         <w:rPr>
           <w:b/>
         </w:rPr>
-        <w:t>older proposals</w:t>
+        <w:t>product plans that still need delivery</w:t>
       </w:r>
       <w:r>
         <w:t xml:space="preserve">, and </w:t>
@@ -131,16 +131,16 @@
     </w:p>
     <w:p>
       <w:r>
-        <w:t xml:space="preserve">The earlier product brief described four main audiences: leadership, e-commerce, marketing, and design/buying. Example decisions were which products merit more attention or stock, where a product attracts visitors but fails to convert, which campaigns and creatives are effective, and which product attributes perform repeatedly. Those questions remain useful </w:t>
+        <w:t xml:space="preserve">The product brief described four main audiences: leadership, e-commerce, marketing, and design/buying. Example decisions were which products merit more attention or stock, where a product attracts visitors but fails to convert, which campaigns and creatives are effective, and which product attributes perform repeatedly. These remain useful </w:t>
       </w:r>
       <w:r>
         <w:rPr>
           <w:b/>
         </w:rPr>
-        <w:t>discovery prompts</w:t>
+        <w:t>product discovery prompts</w:t>
       </w:r>
       <w:r>
-        <w:t>, but they have not been reconfirmed as the current Dalgo delivery scope.</w:t>
+        <w:t>. Their priority and exact first release still need confirmation with the current decision makers.</w:t>
       </w:r>
     </w:p>
     <w:p>
@@ -158,7 +158,7 @@
     </w:p>
     <w:p>
       <w:r>
-        <w:t xml:space="preserve">The archived </w:t>
+        <w:t xml:space="preserve">The </w:t>
       </w:r>
       <w:r>
         <w:rPr>
@@ -168,16 +168,16 @@
         <w:t>docs/Steele Intel - Product Brief and Dev Roadmap.docx</w:t>
       </w:r>
       <w:r>
-        <w:t xml:space="preserve"> was drafted in June 2026 for a custom build. It proposed Shopify, GA4, and Meta integrations; a governed database; daily refresh jobs; dashboards; later natural-language querying, automated insights, and image analysis. Its Phase 1 roadmap estimated 10–12 calendar weeks under the staffing assumptions at that time. Meeting notes embedded in that file also discussed Django, a frontend choice, Neon Postgres, and saved dashboard layouts. These are records of </w:t>
+        <w:t xml:space="preserve"> was drafted in June 2026. It proposed Shopify, GA4, and Meta integrations; a governed database; daily refresh jobs; dashboards; later natural-language querying, automated insights, and image analysis. </w:t>
       </w:r>
       <w:r>
         <w:rPr>
           <w:b/>
         </w:rPr>
-        <w:t>previous discussions</w:t>
+        <w:t>Its product goals largely remain relevant.</w:t>
       </w:r>
       <w:r>
-        <w:t>, not present commitments or a current schedule.</w:t>
+        <w:t xml:space="preserve"> The change is who provides the aggregation and database foundation: Dalgo takes that responsibility, while Creatnet owns the product and analytics work around it and builds missing connectors when needed. The brief's Phase 1 estimate of 10–12 calendar weeks depended on the former staffing and architecture assumptions, so it is not a verified current schedule. Meeting notes embedded in the file discussed Django, a frontend choice, Neon Postgres, and saved dashboard layouts; those technology choices need review against the Dalgo arrangement.</w:t>
       </w:r>
     </w:p>
     <w:tbl>
@@ -257,7 +257,7 @@
                 <w:color w:val="FFFFFF"/>
                 <w:sz w:val="17"/>
               </w:rPr>
-              <w:t>Previous proposal</w:t>
+              <w:t>Earlier brief</w:t>
             </w:r>
           </w:p>
         </w:tc>
@@ -290,7 +290,7 @@
                 <w:color w:val="FFFFFF"/>
                 <w:sz w:val="17"/>
               </w:rPr>
-              <w:t>Current status</w:t>
+              <w:t>Current responsibility or status</w:t>
             </w:r>
           </w:p>
         </w:tc>
@@ -322,7 +322,7 @@
               <w:rPr>
                 <w:sz w:val="17"/>
               </w:rPr>
-              <w:t>Data platform</w:t>
+              <w:t>Data aggregation and database</w:t>
             </w:r>
           </w:p>
         </w:tc>
@@ -352,7 +352,7 @@
               <w:rPr>
                 <w:sz w:val="17"/>
               </w:rPr>
-              <w:t>Creatnet builds and operates its own database and source connectors</w:t>
+              <w:t>Creatnet designs and operates the central data foundation</w:t>
             </w:r>
           </w:p>
         </w:tc>
@@ -382,7 +382,7 @@
               <w:rPr>
                 <w:sz w:val="17"/>
               </w:rPr>
-              <w:t>Creatnet plans to use Dalgo under a Tech4Dev deal; exact arrangement is unknown</w:t>
+              <w:t>Dalgo handles aggregation and the database; its exact setup and data handoff need confirmation</w:t>
             </w:r>
           </w:p>
         </w:tc>
@@ -415,7 +415,7 @@
               <w:rPr>
                 <w:sz w:val="17"/>
               </w:rPr>
-              <w:t>Dashboards and ingestion</w:t>
+              <w:t>Source connectors</w:t>
             </w:r>
           </w:p>
         </w:tc>
@@ -446,7 +446,7 @@
               <w:rPr>
                 <w:sz w:val="17"/>
               </w:rPr>
-              <w:t>Custom Phase 1 implementation and roadmap</w:t>
+              <w:t>Custom integrations were part of the build</w:t>
             </w:r>
           </w:p>
         </w:tc>
@@ -477,7 +477,7 @@
               <w:rPr>
                 <w:sz w:val="17"/>
               </w:rPr>
-              <w:t>Needs fresh product and Dalgo scope discovery</w:t>
+              <w:t>Use Dalgo's integrations where they meet requirements; Creatnet builds a missing Shopify, GA4, Meta, or other connector in the Dalgo repository if required</w:t>
             </w:r>
           </w:p>
         </w:tc>
@@ -509,7 +509,7 @@
               <w:rPr>
                 <w:sz w:val="17"/>
               </w:rPr>
-              <w:t>Python in this repository</w:t>
+              <w:t>Analytics and dashboards</w:t>
             </w:r>
           </w:p>
         </w:tc>
@@ -539,7 +539,7 @@
               <w:rPr>
                 <w:sz w:val="17"/>
               </w:rPr>
-              <w:t>Early source exploration before custom development</w:t>
+              <w:t>Creatnet builds decision-ready reporting and product views</w:t>
             </w:r>
           </w:p>
         </w:tc>
@@ -569,7 +569,7 @@
               <w:rPr>
                 <w:sz w:val="17"/>
               </w:rPr>
-              <w:t>Historical evidence and optional checks; not the production platform</w:t>
+              <w:t>Remain Creatnet's work; confirm first users, metrics, and release scope</w:t>
             </w:r>
           </w:p>
         </w:tc>
@@ -602,7 +602,7 @@
               <w:rPr>
                 <w:sz w:val="17"/>
               </w:rPr>
-              <w:t>Metric definitions and reconciliation</w:t>
+              <w:t>Later intelligence</w:t>
             </w:r>
           </w:p>
         </w:tc>
@@ -633,7 +633,7 @@
               <w:rPr>
                 <w:sz w:val="17"/>
               </w:rPr>
-              <w:t>Requirements for the custom system</w:t>
+              <w:t>Natural-language querying, ML, and image analysis follow the foundation</w:t>
             </w:r>
           </w:p>
         </w:tc>
@@ -664,7 +664,7 @@
               <w:rPr>
                 <w:sz w:val="17"/>
               </w:rPr>
-              <w:t>Still valuable questions to settle with stakeholders and Dalgo</w:t>
+              <w:t>Remain in the product direction and Creatnet's remit; timing and acceptance criteria need review</w:t>
             </w:r>
           </w:p>
         </w:tc>
@@ -695,7 +695,7 @@
               <w:rPr>
                 <w:sz w:val="17"/>
               </w:rPr>
-              <w:t>Chatbot, ML, and image analysis</w:t>
+              <w:t>This repository</w:t>
             </w:r>
           </w:p>
         </w:tc>
@@ -724,7 +724,7 @@
               <w:rPr>
                 <w:sz w:val="17"/>
               </w:rPr>
-              <w:t>Later phases in the old brief</w:t>
+              <w:t>Early source exploration before development</w:t>
             </w:r>
           </w:p>
         </w:tc>
@@ -753,7 +753,7 @@
               <w:rPr>
                 <w:sz w:val="17"/>
               </w:rPr>
-              <w:t>Unconfirmed ideas, not approved deliverables</w:t>
+              <w:t>Preserved evidence and reusable experiments; any needed production connector belongs in the Dalgo repository</w:t>
             </w:r>
           </w:p>
         </w:tc>
@@ -769,10 +769,24 @@
         <w:rPr>
           <w:b/>
         </w:rPr>
-        <w:t>Do not use the old brief as an instruction to build a database or dashboard.</w:t>
+        <w:t>Use the brief for the product vision, user questions, analytics, dashboard, and later intelligence goals. Replace its custom database and aggregation design with the Dalgo arrangement.</w:t>
       </w:r>
       <w:r>
-        <w:t xml:space="preserve"> It remains useful for understanding the original problem, possible users, example questions, candidate metrics, and risks that may still apply. Revalidate each requirement with the current decision makers.</w:t>
+        <w:t xml:space="preserve"> Treat its schedule and specific technology choices as proposals until they are updated with Tech4Dev and the Creatnet team.</w:t>
+      </w:r>
+    </w:p>
+    <w:p>
+      <w:r>
+        <w:t xml:space="preserve">The expected division of work is: </w:t>
+      </w:r>
+      <w:r>
+        <w:rPr>
+          <w:b/>
+        </w:rPr>
+        <w:t>source systems → Dalgo integration or a Creatnet-built connector in the Dalgo repository → Dalgo aggregation and database → Creatnet analytics, dashboards, and later intelligence features</w:t>
+      </w:r>
+      <w:r>
+        <w:t>. The interface between Dalgo's stored data and Creatnet's product still needs to be designed and tested.</w:t>
       </w:r>
     </w:p>
     <w:p>
@@ -809,17 +823,7 @@
         <w:t>outputs/</w:t>
       </w:r>
       <w:r>
-        <w:t xml:space="preserve">. Some files represent only one page of API results or one fixed historical date range. The working tree also contains uncommitted Meta OAuth and object-story work and edits to </w:t>
-      </w:r>
-      <w:r>
-        <w:rPr>
-          <w:rFonts w:ascii="Aptos Mono" w:hAnsi="Aptos Mono"/>
-          <w:sz w:val="17"/>
-        </w:rPr>
-        <w:t>README.md</w:t>
-      </w:r>
-      <w:r>
-        <w:t>; these have been left intact.</w:t>
+        <w:t>. Some files represent only one page of API results or one fixed historical date range. The unfinished Meta OAuth and object-story experiments were preserved in a separate work-in-progress commit; they are evidence of an interrupted investigation, not a complete connector.</w:t>
       </w:r>
     </w:p>
     <w:p>
@@ -842,7 +846,7 @@
         <w:t>README.md</w:t>
       </w:r>
       <w:r>
-        <w:t xml:space="preserve"> — How the discovery scripts and local configuration work. Technical guide; its original build-plan sections are historical.</w:t>
+        <w:t xml:space="preserve"> — How the discovery scripts and local configuration work. Technical guide; read its build phases with the Dalgo responsibility split in mind.</w:t>
       </w:r>
     </w:p>
     <w:p>
@@ -857,7 +861,7 @@
         <w:t>docs/Steele Intel - Product Brief and Dev Roadmap.docx</w:t>
       </w:r>
       <w:r>
-        <w:t xml:space="preserve"> — Old vision, users, proposed metrics, custom-build roadmap, meeting notes. Background only; roadmap superseded.</w:t>
+        <w:t xml:space="preserve"> — Product vision, users, proposed metrics, phases, and meeting notes. Product direction remains relevant; custom database design and old estimates need revision.</w:t>
       </w:r>
     </w:p>
     <w:p>
@@ -887,7 +891,7 @@
         <w:t>shopify_discovery/, ga4_discovery/, meta_discovery/</w:t>
       </w:r>
       <w:r>
-        <w:t xml:space="preserve"> — Shared configuration, authentication, and API request helpers. Research code, not production connectors.</w:t>
+        <w:t xml:space="preserve"> — Shared configuration, authentication, and API request helpers. Research code that can inform Creatnet-built connectors if needed.</w:t>
       </w:r>
     </w:p>
     <w:p>
@@ -1082,7 +1086,7 @@
     </w:p>
     <w:p>
       <w:r>
-        <w:t xml:space="preserve">An uncommitted OAuth flow and object-story script were then added. The saved object-story file contains 15 attempted examples, each with an object-story ID, but </w:t>
+        <w:t xml:space="preserve">An OAuth flow and object-story script were added as an explicitly unfinished experiment. The saved object-story file contains 15 attempted examples, each with an object-story ID, but </w:t>
       </w:r>
       <w:r>
         <w:rPr>
@@ -1290,7 +1294,7 @@
         <w:t>Business and product.</w:t>
       </w:r>
       <w:r>
-        <w:t xml:space="preserve"> The current priority users, exact decisions, minimum useful dashboard or report, success measures, rollout sequence, and decision owners have not been reconfirmed since the Dalgo switch. The earlier brief's lists are starting hypotheses.</w:t>
+        <w:t xml:space="preserve"> The brief supplies candidate users, decisions, dashboards, and success measures, but their priority, first release, rollout sequence, and decision owners have not been reconfirmed since the Dalgo switch.</w:t>
       </w:r>
     </w:p>
     <w:p>
@@ -1301,7 +1305,7 @@
         <w:t>Agreement and operating model.</w:t>
       </w:r>
       <w:r>
-        <w:t xml:space="preserve"> This repository does not contain the Creatnet–Tech4Dev agreement or an agreed scope. Who hosts Dalgo and the data warehouse, who configures and maintains connectors, who owns transformations and metric definitions, what support is included, what access Creatnet receives, what it costs, and when milestones occur all need confirmation. The statement “using Dalgo” alone does not settle them.</w:t>
+        <w:t xml:space="preserve"> Dalgo owns aggregation and the database foundation; Creatnet owns missing custom connectors, analytics, dashboards, and later intelligence work. This repository does not contain the Creatnet–Tech4Dev agreement or its technical scope. Hosting, integration configuration, data refreshes, the boundary between warehouse preparation and product analytics, database access, support, cost, and milestones still need confirmation.</w:t>
       </w:r>
     </w:p>
     <w:p>
@@ -1312,7 +1316,7 @@
         <w:t>Source coverage.</w:t>
       </w:r>
       <w:r>
-        <w:t xml:space="preserve"> No source-by-source Dalgo proof exists here for Shopify, GA4, or Meta Ads. The presence of a source type in an underlying integration ecosystem does not prove that the specific Steele account, permissions, required fields, refresh schedule, history, or commercial definitions will work. Microsoft Clarity, Klaviyo, Xero, and other systems were mentioned in old planning but were not explored in this repository.</w:t>
+        <w:t xml:space="preserve"> No source-by-source Dalgo proof exists here for Shopify, GA4, or Meta Ads. If a required integration is unavailable or insufficient, Creatnet will build a custom connector in the Dalgo repository. Before making that decision, check whether the specific Steele account, permissions, required fields, refresh schedule, history, and commercial definitions work through Dalgo's existing options. Microsoft Clarity, Klaviyo, Xero, and other systems were mentioned in old planning but were not explored in this repository.</w:t>
       </w:r>
     </w:p>
     <w:p>
@@ -1407,10 +1411,10 @@
         <w:rPr>
           <w:b/>
         </w:rPr>
-        <w:t>not evidence of Creatnet's configured workspace or contracted features</w:t>
+        <w:t>not evidence of Creatnet's configured workspace, connector coverage, or contracted features</w:t>
       </w:r>
       <w:r>
-        <w:t>.</w:t>
+        <w:t>. Dalgo's public visualisation features do not change the project owner's stated division of responsibility for Creatnet's analytics and product work.</w:t>
       </w:r>
     </w:p>
     <w:p>
@@ -1496,7 +1500,7 @@
         <w:t>Review Dalgo with Tech4Dev.</w:t>
       </w:r>
       <w:r>
-        <w:t xml:space="preserve"> Walk through the selected decisions and the known July reconciliation. Ask for a source-by-source demonstration or written mapping of required connectors, streams, historical backfill, scheduling, transformations, charting, permissions, error visibility, and data export. Record who does each task and what the contract covers. Do not assume that a public feature is part of this deployment.</w:t>
+        <w:t xml:space="preserve"> Walk through the selected sources and the known July reconciliation. Ask which connectors and streams work, what historical backfill and refreshes Dalgo will provide, how failed runs are exposed, and how Creatnet will read the aggregated data. List any connector gaps that Creatnet must implement in the Dalgo repository. Record the contract boundary and each team's owner for the handoff.</w:t>
       </w:r>
     </w:p>
     <w:p>
@@ -1510,7 +1514,7 @@
         <w:t>Validate one narrow end-to-end example.</w:t>
       </w:r>
       <w:r>
-        <w:t xml:space="preserve"> Choose one product-level question and one closed date range. Trace it from source report to Dalgo output, compare IDs and totals, investigate differences, and record the limits. This is a product acceptance check, whether it is done by Creatnet or Tech4Dev.</w:t>
+        <w:t xml:space="preserve"> Choose one product-level question and one closed date range. Trace it from source report through Dalgo's aggregated data into Creatnet's analysis, compare IDs and totals, investigate differences, and record the limits. This tests both sides of the data handoff.</w:t>
       </w:r>
     </w:p>
     <w:p>
@@ -1524,7 +1528,7 @@
         <w:t>Agree the first deliverable.</w:t>
       </w:r>
       <w:r>
-        <w:t xml:space="preserve"> Document the audience, 3–5 questions it must answer, accepted definitions, source coverage, freshness target, known exclusions, owner, review date, and evidence needed to call it useful. Keep future AI and image ideas separate until the foundation is trusted.</w:t>
+        <w:t xml:space="preserve"> Document the audience, 3–5 questions it must answer, accepted definitions, source coverage, freshness target, known exclusions, Dalgo and Creatnet owners, review date, and evidence needed to call it useful. Plan later ML and image features against the same trusted data foundation.</w:t>
       </w:r>
     </w:p>
     <w:p>
@@ -1540,7 +1544,7 @@
         <w:pStyle w:val="ListBullet"/>
       </w:pPr>
       <w:r>
-        <w:t xml:space="preserve">Which of Shopify, GA4, and Meta Ads can be connected in </w:t>
+        <w:t xml:space="preserve">Which of Shopify, GA4, and Meta Ads can Dalgo connect in </w:t>
       </w:r>
       <w:r>
         <w:rPr>
@@ -1549,7 +1553,7 @@
         <w:t>our</w:t>
       </w:r>
       <w:r>
-        <w:t xml:space="preserve"> Dalgo environment today, and which specific data objects, fields, and history can each connection provide?</w:t>
+        <w:t xml:space="preserve"> environment today, and which specific objects, fields, and history can each connection provide? What interface, review process, and maintenance arrangement should a Creatnet-built connector use in the Dalgo repository?</w:t>
       </w:r>
     </w:p>
     <w:p>
@@ -1557,7 +1561,7 @@
         <w:pStyle w:val="ListBullet"/>
       </w:pPr>
       <w:r>
-        <w:t>Who will set up credentials, refreshes, backfills, transformations, quality checks, and dashboards? How will Creatnet see and resolve a failed or stale run?</w:t>
+        <w:t>Who sets up credentials, refreshes, backfills, warehouse preparation, and quality checks? How will Creatnet see and resolve a failed or stale run?</w:t>
       </w:r>
     </w:p>
     <w:p>
@@ -1565,7 +1569,7 @@
         <w:pStyle w:val="ListBullet"/>
       </w:pPr>
       <w:r>
-        <w:t>Where will the warehouse be hosted, who owns the data and metric definitions, and how can Creatnet export its data and work if the arrangement changes?</w:t>
+        <w:t>Where will the database be hosted, how will Creatnet's analytics code read it, and how can Creatnet export the data and its work if the arrangement changes?</w:t>
       </w:r>
     </w:p>
     <w:p>
@@ -1581,7 +1585,7 @@
         <w:pStyle w:val="ListBullet"/>
       </w:pPr>
       <w:r>
-        <w:t>Which dashboards, roles, and sharing options are included in the deal, and what are the agreed first milestone and acceptance criteria?</w:t>
+        <w:t>What is the agreed first data handoff milestone and acceptance test? Are any Dalgo charts or reports useful as supporting tools while Creatnet builds its analytics experience?</w:t>
       </w:r>
     </w:p>
     <w:p>
@@ -1685,7 +1689,17 @@
     </w:p>
     <w:p>
       <w:r>
-        <w:t xml:space="preserve">For a quick restart, read this document, then </w:t>
+        <w:t xml:space="preserve">For a quick restart, read this document, then the </w:t>
+      </w:r>
+      <w:r>
+        <w:rPr>
+          <w:rFonts w:ascii="Aptos Mono" w:hAnsi="Aptos Mono"/>
+          <w:sz w:val="17"/>
+        </w:rPr>
+        <w:t>docs/Steele Intel - Product Brief and Dev Roadmap.docx</w:t>
+      </w:r>
+      <w:r>
+        <w:t xml:space="preserve"> for the largely unchanged product vision, then </w:t>
       </w:r>
       <w:r>
         <w:rPr>
@@ -1695,7 +1709,7 @@
         <w:t>README.md</w:t>
       </w:r>
       <w:r>
-        <w:t xml:space="preserve"> for repository mechanics, then </w:t>
+        <w:t xml:space="preserve"> for repository mechanics, and </w:t>
       </w:r>
       <w:r>
         <w:rPr>
@@ -1705,7 +1719,7 @@
         <w:t>docs/ga4_discovery_current_state.md</w:t>
       </w:r>
       <w:r>
-        <w:t xml:space="preserve"> for the detailed Shopify–GA4 reasoning. Read the old product brief only for historical vision and candidate questions. Open saved outputs only when checking a specific claim; some contain order-level or ad-level records. The most important local evidence is:</w:t>
+        <w:t xml:space="preserve"> for detailed Shopify–GA4 reasoning. Use this handoff to override the brief's custom aggregation/database architecture and old schedule. Open saved outputs only when checking a specific claim; some contain order-level or ad-level records. The most important local evidence is:</w:t>
       </w:r>
     </w:p>
     <w:p>
@@ -1785,7 +1799,7 @@
         <w:t>outputs/meta_discovery/list_creatives_of_15_ads.json</w:t>
       </w:r>
       <w:r>
-        <w:t xml:space="preserve"> and the uncommitted </w:t>
+        <w:t xml:space="preserve"> and </w:t>
       </w:r>
       <w:r>
         <w:rPr>
@@ -1795,7 +1809,7 @@
         <w:t>object_stories_of_15_ads.json</w:t>
       </w:r>
       <w:r>
-        <w:t xml:space="preserve"> for the Meta exploration and permission failure.</w:t>
+        <w:t xml:space="preserve"> for the unfinished Meta exploration and permission failure.</w:t>
       </w:r>
     </w:p>
     <w:p>
@@ -1848,7 +1862,7 @@
         </w:r>
       </w:hyperlink>
       <w:r>
-        <w:t>. Public descriptions can change. Creatnet's agreement and live workspace are the authorities for its actual delivery scope.</w:t>
+        <w:t>. Public descriptions can change. The project owner's responsibility split stated above is the current project direction; the agreement and live workspace will define the technical delivery details.</w:t>
       </w:r>
     </w:p>
     <w:sectPr>

</xml_diff>

<commit_message>
docs: remove discovery action plan from handoff
</commit_message>
<xml_diff>
--- a/docs/Product_Intelligence_Discovery_Handoff_2026-09-29.docx
+++ b/docs/Product_Intelligence_Discovery_Handoff_2026-09-29.docx
@@ -1439,160 +1439,6 @@
         <w:pStyle w:val="Heading1"/>
       </w:pPr>
       <w:r>
-        <w:t>A practical path for discovery without code</w:t>
-      </w:r>
-    </w:p>
-    <w:p>
-      <w:r>
-        <w:t>The aim is to turn past technical evidence into a small, agreed business and delivery scope. Each step should produce something a person can review without running this repository.</w:t>
-      </w:r>
-    </w:p>
-    <w:p>
-      <w:pPr>
-        <w:pStyle w:val="ListNumber"/>
-      </w:pPr>
-      <w:r>
-        <w:rPr>
-          <w:b/>
-        </w:rPr>
-        <w:t>Reconfirm the decisions.</w:t>
-      </w:r>
-      <w:r>
-        <w:t xml:space="preserve"> Interview leadership, e-commerce, marketing, and design/buying. Ask each person what decision they make, how often, what they use now, where they disagree, and what action a useful answer would change. Select the first few decisions before choosing charts.</w:t>
-      </w:r>
-    </w:p>
-    <w:p>
-      <w:pPr>
-        <w:pStyle w:val="ListNumber"/>
-      </w:pPr>
-      <w:r>
-        <w:rPr>
-          <w:b/>
-        </w:rPr>
-        <w:t>Define the measures.</w:t>
-      </w:r>
-      <w:r>
-        <w:t xml:space="preserve"> For each chosen question, write the metric name, plain-language meaning, source of authority, formula, date/time zone, currency, refund and attribution rules, level of detail, and owner. Start with revenue, orders, product demand, inventory availability, product views, cart actions, and advertising spend where relevant.</w:t>
-      </w:r>
-    </w:p>
-    <w:p>
-      <w:pPr>
-        <w:pStyle w:val="ListNumber"/>
-      </w:pPr>
-      <w:r>
-        <w:rPr>
-          <w:b/>
-        </w:rPr>
-        <w:t>Make a source inventory.</w:t>
-      </w:r>
-      <w:r>
-        <w:t xml:space="preserve"> With source owners, record the exact Steele Shopify store(s), GA4 property and web stream(s), Meta ad account(s), and any new sources. Record access owner, historical range, refresh needs, privacy constraints, and whether the source is reliable enough for the selected questions.</w:t>
-      </w:r>
-    </w:p>
-    <w:p>
-      <w:pPr>
-        <w:pStyle w:val="ListNumber"/>
-      </w:pPr>
-      <w:r>
-        <w:rPr>
-          <w:b/>
-        </w:rPr>
-        <w:t>Review Dalgo with Tech4Dev.</w:t>
-      </w:r>
-      <w:r>
-        <w:t xml:space="preserve"> Walk through the selected sources and the known July reconciliation. Ask which connectors and streams work, what historical backfill and refreshes Dalgo will provide, how failed runs are exposed, and how Creatnet will read the aggregated data. List any connector gaps that Creatnet must implement in the Dalgo repository. Record the contract boundary and each team's owner for the handoff.</w:t>
-      </w:r>
-    </w:p>
-    <w:p>
-      <w:pPr>
-        <w:pStyle w:val="ListNumber"/>
-      </w:pPr>
-      <w:r>
-        <w:rPr>
-          <w:b/>
-        </w:rPr>
-        <w:t>Validate one narrow end-to-end example.</w:t>
-      </w:r>
-      <w:r>
-        <w:t xml:space="preserve"> Choose one product-level question and one closed date range. Trace it from source report through Dalgo's aggregated data into Creatnet's analysis, compare IDs and totals, investigate differences, and record the limits. This tests both sides of the data handoff.</w:t>
-      </w:r>
-    </w:p>
-    <w:p>
-      <w:pPr>
-        <w:pStyle w:val="ListNumber"/>
-      </w:pPr>
-      <w:r>
-        <w:rPr>
-          <w:b/>
-        </w:rPr>
-        <w:t>Agree the first deliverable.</w:t>
-      </w:r>
-      <w:r>
-        <w:t xml:space="preserve"> Document the audience, 3–5 questions it must answer, accepted definitions, source coverage, freshness target, known exclusions, Dalgo and Creatnet owners, review date, and evidence needed to call it useful. Plan later ML and image features against the same trusted data foundation.</w:t>
-      </w:r>
-    </w:p>
-    <w:p>
-      <w:pPr>
-        <w:pStyle w:val="Heading2"/>
-      </w:pPr>
-      <w:r>
-        <w:t>Questions worth taking to the first Tech4Dev discussion</w:t>
-      </w:r>
-    </w:p>
-    <w:p>
-      <w:pPr>
-        <w:pStyle w:val="ListBullet"/>
-      </w:pPr>
-      <w:r>
-        <w:t xml:space="preserve">Which of Shopify, GA4, and Meta Ads can Dalgo connect in </w:t>
-      </w:r>
-      <w:r>
-        <w:rPr>
-          <w:b/>
-        </w:rPr>
-        <w:t>our</w:t>
-      </w:r>
-      <w:r>
-        <w:t xml:space="preserve"> environment today, and which specific objects, fields, and history can each connection provide? What interface, review process, and maintenance arrangement should a Creatnet-built connector use in the Dalgo repository?</w:t>
-      </w:r>
-    </w:p>
-    <w:p>
-      <w:pPr>
-        <w:pStyle w:val="ListBullet"/>
-      </w:pPr>
-      <w:r>
-        <w:t>Who sets up credentials, refreshes, backfills, warehouse preparation, and quality checks? How will Creatnet see and resolve a failed or stale run?</w:t>
-      </w:r>
-    </w:p>
-    <w:p>
-      <w:pPr>
-        <w:pStyle w:val="ListBullet"/>
-      </w:pPr>
-      <w:r>
-        <w:t>Where will the database be hosted, how will Creatnet's analytics code read it, and how can Creatnet export the data and its work if the arrangement changes?</w:t>
-      </w:r>
-    </w:p>
-    <w:p>
-      <w:pPr>
-        <w:pStyle w:val="ListBullet"/>
-      </w:pPr>
-      <w:r>
-        <w:t>Can we keep Shopify commercial measures distinct from GA4 behaviour and clearly label selected-window coverage gaps?</w:t>
-      </w:r>
-    </w:p>
-    <w:p>
-      <w:pPr>
-        <w:pStyle w:val="ListBullet"/>
-      </w:pPr>
-      <w:r>
-        <w:t>What is the agreed first data handoff milestone and acceptance test? Are any Dalgo charts or reports useful as supporting tools while Creatnet builds its analytics experience?</w:t>
-      </w:r>
-    </w:p>
-    <w:p>
-      <w:pPr>
-        <w:pStyle w:val="Heading1"/>
-      </w:pPr>
-      <w:r>
         <w:t>Glossary for new readers</w:t>
       </w:r>
     </w:p>

</xml_diff>